<commit_message>
Manual: logo del INE y sin botón de imprimir (HTML y Word)
- Encabezado con el logo del INE (compuesto sobre fondo oscuro para que sea
  visible en documento blanco y en Word).
- Se quita el botón 'Imprimir' de la versión HTML.
- .docx regenerado con el logo.

Co-Authored-By: Claude Opus 4.8 <noreply@anthropic.com>
</commit_message>
<xml_diff>
--- a/Manual-Consejeros.docx
+++ b/Manual-Consejeros.docx
@@ -5,9 +5,74 @@
   <w:body>
     <w:p>
       <w:pPr>
+        <w:shd w:val="clear" w:color="auto" w:fill="FFFFFF"/>
+        <w:divId w:val="782577528"/>
+        <w:rPr>
+          <w:rFonts w:ascii="Segoe UI" w:eastAsia="Times New Roman" w:hAnsi="Segoe UI" w:cs="Segoe UI"/>
+          <w:lang w:val="es-ES"/>
+        </w:rPr>
+      </w:pPr>
+      <w:r>
+        <w:rPr>
+          <w:rFonts w:ascii="Segoe UI" w:eastAsia="Times New Roman" w:hAnsi="Segoe UI" w:cs="Segoe UI"/>
+          <w:noProof/>
+          <w:lang w:val="es-ES"/>
+        </w:rPr>
+        <w:drawing>
+          <wp:inline distT="0" distB="0" distL="0" distR="0" wp14:anchorId="73CD1191" wp14:editId="1D27CFC1">
+            <wp:extent cx="2305050" cy="1085850"/>
+            <wp:effectExtent l="0" t="0" r="0" b="0"/>
+            <wp:docPr id="1" name="Imagen 1" descr="Instituto Nacional Electoral"/>
+            <wp:cNvGraphicFramePr>
+              <a:graphicFrameLocks xmlns:a="http://schemas.openxmlformats.org/drawingml/2006/main" noChangeAspect="1"/>
+            </wp:cNvGraphicFramePr>
+            <a:graphic xmlns:a="http://schemas.openxmlformats.org/drawingml/2006/main">
+              <a:graphicData uri="http://schemas.openxmlformats.org/drawingml/2006/picture">
+                <pic:pic xmlns:pic="http://schemas.openxmlformats.org/drawingml/2006/picture">
+                  <pic:nvPicPr>
+                    <pic:cNvPr id="0" name="Picture 1" descr="Instituto Nacional Electoral"/>
+                    <pic:cNvPicPr>
+                      <a:picLocks noChangeAspect="1" noChangeArrowheads="1"/>
+                    </pic:cNvPicPr>
+                  </pic:nvPicPr>
+                  <pic:blipFill>
+                    <a:blip r:embed="rId5">
+                      <a:extLst>
+                        <a:ext uri="{28A0092B-C50C-407E-A947-70E740481C1C}">
+                          <a14:useLocalDpi xmlns:a14="http://schemas.microsoft.com/office/drawing/2010/main" val="0"/>
+                        </a:ext>
+                      </a:extLst>
+                    </a:blip>
+                    <a:srcRect/>
+                    <a:stretch>
+                      <a:fillRect/>
+                    </a:stretch>
+                  </pic:blipFill>
+                  <pic:spPr bwMode="auto">
+                    <a:xfrm>
+                      <a:off x="0" y="0"/>
+                      <a:ext cx="2305050" cy="1085850"/>
+                    </a:xfrm>
+                    <a:prstGeom prst="rect">
+                      <a:avLst/>
+                    </a:prstGeom>
+                    <a:noFill/>
+                    <a:ln>
+                      <a:noFill/>
+                    </a:ln>
+                  </pic:spPr>
+                </pic:pic>
+              </a:graphicData>
+            </a:graphic>
+          </wp:inline>
+        </w:drawing>
+      </w:r>
+    </w:p>
+    <w:p>
+      <w:pPr>
         <w:pStyle w:val="Ttulo1"/>
         <w:shd w:val="clear" w:color="auto" w:fill="FFFFFF"/>
-        <w:divId w:val="904099955"/>
+        <w:divId w:val="694236333"/>
         <w:rPr>
           <w:rFonts w:ascii="Segoe UI" w:eastAsia="Times New Roman" w:hAnsi="Segoe UI" w:cs="Segoe UI"/>
           <w:lang w:val="es-ES"/>
@@ -25,7 +90,7 @@
       <w:pPr>
         <w:pStyle w:val="NormalWeb"/>
         <w:shd w:val="clear" w:color="auto" w:fill="FFFFFF"/>
-        <w:divId w:val="904099955"/>
+        <w:divId w:val="694236333"/>
         <w:rPr>
           <w:rFonts w:ascii="Segoe UI" w:hAnsi="Segoe UI" w:cs="Segoe UI"/>
           <w:lang w:val="es-ES"/>
@@ -43,7 +108,7 @@
       <w:pPr>
         <w:pStyle w:val="NormalWeb"/>
         <w:shd w:val="clear" w:color="auto" w:fill="FFFFFF"/>
-        <w:divId w:val="904099955"/>
+        <w:divId w:val="782577528"/>
         <w:rPr>
           <w:rFonts w:ascii="Segoe UI" w:hAnsi="Segoe UI" w:cs="Segoe UI"/>
           <w:lang w:val="es-ES"/>
@@ -91,7 +156,7 @@
       <w:pPr>
         <w:pStyle w:val="Ttulo2"/>
         <w:shd w:val="clear" w:color="auto" w:fill="FFFFFF"/>
-        <w:divId w:val="904099955"/>
+        <w:divId w:val="782577528"/>
         <w:rPr>
           <w:rFonts w:ascii="Segoe UI" w:eastAsia="Times New Roman" w:hAnsi="Segoe UI" w:cs="Segoe UI"/>
           <w:lang w:val="es-ES"/>
@@ -113,7 +178,7 @@
         </w:numPr>
         <w:shd w:val="clear" w:color="auto" w:fill="FFFFFF"/>
         <w:spacing w:before="100" w:beforeAutospacing="1" w:after="75"/>
-        <w:divId w:val="904099955"/>
+        <w:divId w:val="782577528"/>
         <w:rPr>
           <w:rFonts w:ascii="Segoe UI" w:eastAsia="Times New Roman" w:hAnsi="Segoe UI" w:cs="Segoe UI"/>
           <w:sz w:val="21"/>
@@ -155,7 +220,7 @@
         </w:numPr>
         <w:shd w:val="clear" w:color="auto" w:fill="FFFFFF"/>
         <w:spacing w:before="100" w:beforeAutospacing="1" w:after="75"/>
-        <w:divId w:val="904099955"/>
+        <w:divId w:val="782577528"/>
         <w:rPr>
           <w:rFonts w:ascii="Segoe UI" w:eastAsia="Times New Roman" w:hAnsi="Segoe UI" w:cs="Segoe UI"/>
           <w:sz w:val="21"/>
@@ -219,7 +284,7 @@
         </w:numPr>
         <w:shd w:val="clear" w:color="auto" w:fill="FFFFFF"/>
         <w:spacing w:before="100" w:beforeAutospacing="1" w:after="75"/>
-        <w:divId w:val="904099955"/>
+        <w:divId w:val="782577528"/>
         <w:rPr>
           <w:rFonts w:ascii="Segoe UI" w:eastAsia="Times New Roman" w:hAnsi="Segoe UI" w:cs="Segoe UI"/>
           <w:sz w:val="21"/>
@@ -350,7 +415,7 @@
         </w:numPr>
         <w:shd w:val="clear" w:color="auto" w:fill="FFFFFF"/>
         <w:spacing w:before="100" w:beforeAutospacing="1" w:after="75"/>
-        <w:divId w:val="904099955"/>
+        <w:divId w:val="782577528"/>
         <w:rPr>
           <w:rFonts w:ascii="Segoe UI" w:eastAsia="Times New Roman" w:hAnsi="Segoe UI" w:cs="Segoe UI"/>
           <w:sz w:val="21"/>
@@ -400,7 +465,7 @@
     <w:p>
       <w:pPr>
         <w:shd w:val="clear" w:color="auto" w:fill="FFFFFF"/>
-        <w:divId w:val="1156142330"/>
+        <w:divId w:val="920025128"/>
         <w:rPr>
           <w:rFonts w:ascii="Segoe UI" w:eastAsia="Times New Roman" w:hAnsi="Segoe UI" w:cs="Segoe UI"/>
           <w:sz w:val="20"/>
@@ -451,7 +516,7 @@
       <w:pPr>
         <w:pStyle w:val="Ttulo2"/>
         <w:shd w:val="clear" w:color="auto" w:fill="FFFFFF"/>
-        <w:divId w:val="904099955"/>
+        <w:divId w:val="782577528"/>
         <w:rPr>
           <w:rFonts w:ascii="Segoe UI" w:eastAsia="Times New Roman" w:hAnsi="Segoe UI" w:cs="Segoe UI"/>
           <w:lang w:val="es-ES"/>
@@ -473,7 +538,7 @@
         </w:numPr>
         <w:shd w:val="clear" w:color="auto" w:fill="FFFFFF"/>
         <w:spacing w:before="100" w:beforeAutospacing="1" w:after="75"/>
-        <w:divId w:val="904099955"/>
+        <w:divId w:val="782577528"/>
         <w:rPr>
           <w:rFonts w:ascii="Segoe UI" w:eastAsia="Times New Roman" w:hAnsi="Segoe UI" w:cs="Segoe UI"/>
           <w:sz w:val="21"/>
@@ -537,7 +602,7 @@
         </w:numPr>
         <w:shd w:val="clear" w:color="auto" w:fill="FFFFFF"/>
         <w:spacing w:before="100" w:beforeAutospacing="1" w:after="75"/>
-        <w:divId w:val="904099955"/>
+        <w:divId w:val="782577528"/>
         <w:rPr>
           <w:rFonts w:ascii="Segoe UI" w:eastAsia="Times New Roman" w:hAnsi="Segoe UI" w:cs="Segoe UI"/>
           <w:sz w:val="21"/>
@@ -582,7 +647,7 @@
         </w:numPr>
         <w:shd w:val="clear" w:color="auto" w:fill="FFFFFF"/>
         <w:spacing w:before="100" w:beforeAutospacing="1" w:after="75"/>
-        <w:divId w:val="904099955"/>
+        <w:divId w:val="782577528"/>
         <w:rPr>
           <w:rFonts w:ascii="Segoe UI" w:eastAsia="Times New Roman" w:hAnsi="Segoe UI" w:cs="Segoe UI"/>
           <w:sz w:val="21"/>
@@ -623,7 +688,7 @@
       <w:pPr>
         <w:pStyle w:val="Ttulo2"/>
         <w:shd w:val="clear" w:color="auto" w:fill="FFFFFF"/>
-        <w:divId w:val="904099955"/>
+        <w:divId w:val="782577528"/>
         <w:rPr>
           <w:rFonts w:ascii="Segoe UI" w:eastAsia="Times New Roman" w:hAnsi="Segoe UI" w:cs="Segoe UI"/>
           <w:lang w:val="es-ES"/>
@@ -645,7 +710,7 @@
         </w:numPr>
         <w:shd w:val="clear" w:color="auto" w:fill="FFFFFF"/>
         <w:spacing w:before="100" w:beforeAutospacing="1" w:after="75"/>
-        <w:divId w:val="904099955"/>
+        <w:divId w:val="782577528"/>
         <w:rPr>
           <w:rFonts w:ascii="Segoe UI" w:eastAsia="Times New Roman" w:hAnsi="Segoe UI" w:cs="Segoe UI"/>
           <w:sz w:val="21"/>
@@ -681,7 +746,7 @@
         </w:numPr>
         <w:shd w:val="clear" w:color="auto" w:fill="FFFFFF"/>
         <w:spacing w:before="100" w:beforeAutospacing="1" w:after="75"/>
-        <w:divId w:val="904099955"/>
+        <w:divId w:val="782577528"/>
         <w:rPr>
           <w:rFonts w:ascii="Segoe UI" w:eastAsia="Times New Roman" w:hAnsi="Segoe UI" w:cs="Segoe UI"/>
           <w:sz w:val="21"/>
@@ -726,7 +791,7 @@
         </w:numPr>
         <w:shd w:val="clear" w:color="auto" w:fill="FFFFFF"/>
         <w:spacing w:before="100" w:beforeAutospacing="1" w:after="75"/>
-        <w:divId w:val="904099955"/>
+        <w:divId w:val="782577528"/>
         <w:rPr>
           <w:rFonts w:ascii="Segoe UI" w:eastAsia="Times New Roman" w:hAnsi="Segoe UI" w:cs="Segoe UI"/>
           <w:sz w:val="21"/>
@@ -781,21 +846,22 @@
         </w:numPr>
         <w:shd w:val="clear" w:color="auto" w:fill="FFFFFF"/>
         <w:spacing w:before="100" w:beforeAutospacing="1" w:after="75"/>
-        <w:divId w:val="904099955"/>
-        <w:rPr>
-          <w:rFonts w:ascii="Segoe UI" w:eastAsia="Times New Roman" w:hAnsi="Segoe UI" w:cs="Segoe UI"/>
-          <w:sz w:val="21"/>
-          <w:szCs w:val="21"/>
-          <w:lang w:val="es-ES"/>
-        </w:rPr>
-      </w:pPr>
-      <w:r>
-        <w:rPr>
-          <w:rFonts w:ascii="Segoe UI" w:eastAsia="Times New Roman" w:hAnsi="Segoe UI" w:cs="Segoe UI"/>
-          <w:sz w:val="21"/>
-          <w:szCs w:val="21"/>
-          <w:lang w:val="es-ES"/>
-        </w:rPr>
+        <w:divId w:val="782577528"/>
+        <w:rPr>
+          <w:rFonts w:ascii="Segoe UI" w:eastAsia="Times New Roman" w:hAnsi="Segoe UI" w:cs="Segoe UI"/>
+          <w:sz w:val="21"/>
+          <w:szCs w:val="21"/>
+          <w:lang w:val="es-ES"/>
+        </w:rPr>
+      </w:pPr>
+      <w:r>
+        <w:rPr>
+          <w:rFonts w:ascii="Segoe UI" w:eastAsia="Times New Roman" w:hAnsi="Segoe UI" w:cs="Segoe UI"/>
+          <w:sz w:val="21"/>
+          <w:szCs w:val="21"/>
+          <w:lang w:val="es-ES"/>
+        </w:rPr>
+        <w:lastRenderedPageBreak/>
         <w:t xml:space="preserve">Las </w:t>
       </w:r>
       <w:r>
@@ -849,7 +915,7 @@
     <w:p>
       <w:pPr>
         <w:shd w:val="clear" w:color="auto" w:fill="FFFFFF"/>
-        <w:divId w:val="1379206651"/>
+        <w:divId w:val="2042585162"/>
         <w:rPr>
           <w:rFonts w:ascii="Segoe UI" w:eastAsia="Times New Roman" w:hAnsi="Segoe UI" w:cs="Segoe UI"/>
           <w:sz w:val="20"/>
@@ -881,7 +947,7 @@
       <w:pPr>
         <w:pStyle w:val="Ttulo2"/>
         <w:shd w:val="clear" w:color="auto" w:fill="FFFFFF"/>
-        <w:divId w:val="904099955"/>
+        <w:divId w:val="782577528"/>
         <w:rPr>
           <w:rFonts w:ascii="Segoe UI" w:eastAsia="Times New Roman" w:hAnsi="Segoe UI" w:cs="Segoe UI"/>
           <w:lang w:val="es-ES"/>
@@ -903,22 +969,21 @@
         </w:numPr>
         <w:shd w:val="clear" w:color="auto" w:fill="FFFFFF"/>
         <w:spacing w:before="100" w:beforeAutospacing="1" w:after="75"/>
-        <w:divId w:val="904099955"/>
-        <w:rPr>
-          <w:rFonts w:ascii="Segoe UI" w:eastAsia="Times New Roman" w:hAnsi="Segoe UI" w:cs="Segoe UI"/>
-          <w:sz w:val="21"/>
-          <w:szCs w:val="21"/>
-          <w:lang w:val="es-ES"/>
-        </w:rPr>
-      </w:pPr>
-      <w:r>
-        <w:rPr>
-          <w:rFonts w:ascii="Segoe UI" w:eastAsia="Times New Roman" w:hAnsi="Segoe UI" w:cs="Segoe UI"/>
-          <w:sz w:val="21"/>
-          <w:szCs w:val="21"/>
-          <w:lang w:val="es-ES"/>
-        </w:rPr>
-        <w:lastRenderedPageBreak/>
+        <w:divId w:val="782577528"/>
+        <w:rPr>
+          <w:rFonts w:ascii="Segoe UI" w:eastAsia="Times New Roman" w:hAnsi="Segoe UI" w:cs="Segoe UI"/>
+          <w:sz w:val="21"/>
+          <w:szCs w:val="21"/>
+          <w:lang w:val="es-ES"/>
+        </w:rPr>
+      </w:pPr>
+      <w:r>
+        <w:rPr>
+          <w:rFonts w:ascii="Segoe UI" w:eastAsia="Times New Roman" w:hAnsi="Segoe UI" w:cs="Segoe UI"/>
+          <w:sz w:val="21"/>
+          <w:szCs w:val="21"/>
+          <w:lang w:val="es-ES"/>
+        </w:rPr>
         <w:t xml:space="preserve">En una comisión que </w:t>
       </w:r>
       <w:r>
@@ -987,7 +1052,7 @@
         </w:numPr>
         <w:shd w:val="clear" w:color="auto" w:fill="FFFFFF"/>
         <w:spacing w:before="100" w:beforeAutospacing="1" w:after="75"/>
-        <w:divId w:val="904099955"/>
+        <w:divId w:val="782577528"/>
         <w:rPr>
           <w:rFonts w:ascii="Segoe UI" w:eastAsia="Times New Roman" w:hAnsi="Segoe UI" w:cs="Segoe UI"/>
           <w:sz w:val="21"/>
@@ -1032,7 +1097,7 @@
         </w:numPr>
         <w:shd w:val="clear" w:color="auto" w:fill="FFFFFF"/>
         <w:spacing w:before="100" w:beforeAutospacing="1" w:after="75"/>
-        <w:divId w:val="904099955"/>
+        <w:divId w:val="782577528"/>
         <w:rPr>
           <w:rFonts w:ascii="Segoe UI" w:eastAsia="Times New Roman" w:hAnsi="Segoe UI" w:cs="Segoe UI"/>
           <w:sz w:val="21"/>
@@ -1083,7 +1148,7 @@
       <w:pPr>
         <w:pStyle w:val="Ttulo2"/>
         <w:shd w:val="clear" w:color="auto" w:fill="FFFFFF"/>
-        <w:divId w:val="904099955"/>
+        <w:divId w:val="782577528"/>
         <w:rPr>
           <w:rFonts w:ascii="Segoe UI" w:eastAsia="Times New Roman" w:hAnsi="Segoe UI" w:cs="Segoe UI"/>
           <w:lang w:val="es-ES"/>
@@ -1105,7 +1170,7 @@
         </w:numPr>
         <w:shd w:val="clear" w:color="auto" w:fill="FFFFFF"/>
         <w:spacing w:before="100" w:beforeAutospacing="1" w:after="75"/>
-        <w:divId w:val="904099955"/>
+        <w:divId w:val="782577528"/>
         <w:rPr>
           <w:rFonts w:ascii="Segoe UI" w:eastAsia="Times New Roman" w:hAnsi="Segoe UI" w:cs="Segoe UI"/>
           <w:sz w:val="21"/>
@@ -1178,7 +1243,7 @@
         </w:numPr>
         <w:shd w:val="clear" w:color="auto" w:fill="FFFFFF"/>
         <w:spacing w:before="100" w:beforeAutospacing="1" w:after="75"/>
-        <w:divId w:val="904099955"/>
+        <w:divId w:val="782577528"/>
         <w:rPr>
           <w:rFonts w:ascii="Segoe UI" w:eastAsia="Times New Roman" w:hAnsi="Segoe UI" w:cs="Segoe UI"/>
           <w:sz w:val="21"/>
@@ -1242,7 +1307,7 @@
         </w:numPr>
         <w:shd w:val="clear" w:color="auto" w:fill="FFFFFF"/>
         <w:spacing w:before="100" w:beforeAutospacing="1" w:after="75"/>
-        <w:divId w:val="904099955"/>
+        <w:divId w:val="782577528"/>
         <w:rPr>
           <w:rFonts w:ascii="Segoe UI" w:eastAsia="Times New Roman" w:hAnsi="Segoe UI" w:cs="Segoe UI"/>
           <w:sz w:val="21"/>
@@ -1302,7 +1367,7 @@
       <w:pPr>
         <w:pStyle w:val="Ttulo2"/>
         <w:shd w:val="clear" w:color="auto" w:fill="FFFFFF"/>
-        <w:divId w:val="904099955"/>
+        <w:divId w:val="782577528"/>
         <w:rPr>
           <w:rFonts w:ascii="Segoe UI" w:eastAsia="Times New Roman" w:hAnsi="Segoe UI" w:cs="Segoe UI"/>
           <w:lang w:val="es-ES"/>
@@ -1320,7 +1385,7 @@
       <w:pPr>
         <w:pStyle w:val="NormalWeb"/>
         <w:shd w:val="clear" w:color="auto" w:fill="FFFFFF"/>
-        <w:divId w:val="904099955"/>
+        <w:divId w:val="782577528"/>
         <w:rPr>
           <w:rFonts w:ascii="Segoe UI" w:hAnsi="Segoe UI" w:cs="Segoe UI"/>
           <w:lang w:val="es-ES"/>
@@ -1389,7 +1454,7 @@
     <w:p>
       <w:pPr>
         <w:shd w:val="clear" w:color="auto" w:fill="FFFFFF"/>
-        <w:divId w:val="1173303932"/>
+        <w:divId w:val="1796828985"/>
         <w:rPr>
           <w:rFonts w:ascii="Segoe UI" w:eastAsia="Times New Roman" w:hAnsi="Segoe UI" w:cs="Segoe UI"/>
           <w:sz w:val="20"/>
@@ -1468,7 +1533,7 @@
       <w:pPr>
         <w:pStyle w:val="Ttulo2"/>
         <w:shd w:val="clear" w:color="auto" w:fill="FFFFFF"/>
-        <w:divId w:val="904099955"/>
+        <w:divId w:val="782577528"/>
         <w:rPr>
           <w:rFonts w:ascii="Segoe UI" w:eastAsia="Times New Roman" w:hAnsi="Segoe UI" w:cs="Segoe UI"/>
           <w:lang w:val="es-ES"/>
@@ -1490,7 +1555,7 @@
         </w:numPr>
         <w:shd w:val="clear" w:color="auto" w:fill="FFFFFF"/>
         <w:spacing w:before="100" w:beforeAutospacing="1" w:after="75"/>
-        <w:divId w:val="904099955"/>
+        <w:divId w:val="782577528"/>
         <w:rPr>
           <w:rFonts w:ascii="Segoe UI" w:eastAsia="Times New Roman" w:hAnsi="Segoe UI" w:cs="Segoe UI"/>
           <w:sz w:val="21"/>
@@ -1535,7 +1600,7 @@
         </w:numPr>
         <w:shd w:val="clear" w:color="auto" w:fill="FFFFFF"/>
         <w:spacing w:before="100" w:beforeAutospacing="1" w:after="75"/>
-        <w:divId w:val="904099955"/>
+        <w:divId w:val="782577528"/>
         <w:rPr>
           <w:rFonts w:ascii="Segoe UI" w:eastAsia="Times New Roman" w:hAnsi="Segoe UI" w:cs="Segoe UI"/>
           <w:sz w:val="21"/>
@@ -1557,7 +1622,7 @@
       <w:pPr>
         <w:pStyle w:val="Ttulo2"/>
         <w:shd w:val="clear" w:color="auto" w:fill="FFFFFF"/>
-        <w:divId w:val="904099955"/>
+        <w:divId w:val="782577528"/>
         <w:rPr>
           <w:rFonts w:ascii="Segoe UI" w:eastAsia="Times New Roman" w:hAnsi="Segoe UI" w:cs="Segoe UI"/>
           <w:lang w:val="es-ES"/>
@@ -1579,7 +1644,7 @@
         </w:numPr>
         <w:shd w:val="clear" w:color="auto" w:fill="FFFFFF"/>
         <w:spacing w:before="100" w:beforeAutospacing="1" w:after="75"/>
-        <w:divId w:val="904099955"/>
+        <w:divId w:val="782577528"/>
         <w:rPr>
           <w:rFonts w:ascii="Segoe UI" w:eastAsia="Times New Roman" w:hAnsi="Segoe UI" w:cs="Segoe UI"/>
           <w:sz w:val="21"/>
@@ -1624,7 +1689,7 @@
         </w:numPr>
         <w:shd w:val="clear" w:color="auto" w:fill="FFFFFF"/>
         <w:spacing w:before="100" w:beforeAutospacing="1" w:after="75"/>
-        <w:divId w:val="904099955"/>
+        <w:divId w:val="782577528"/>
         <w:rPr>
           <w:rFonts w:ascii="Segoe UI" w:eastAsia="Times New Roman" w:hAnsi="Segoe UI" w:cs="Segoe UI"/>
           <w:sz w:val="21"/>
@@ -1660,22 +1725,23 @@
         </w:numPr>
         <w:shd w:val="clear" w:color="auto" w:fill="FFFFFF"/>
         <w:spacing w:before="100" w:beforeAutospacing="1" w:after="75"/>
-        <w:divId w:val="904099955"/>
-        <w:rPr>
-          <w:rFonts w:ascii="Segoe UI" w:eastAsia="Times New Roman" w:hAnsi="Segoe UI" w:cs="Segoe UI"/>
-          <w:sz w:val="21"/>
-          <w:szCs w:val="21"/>
-          <w:lang w:val="es-ES"/>
-        </w:rPr>
-      </w:pPr>
-      <w:r>
-        <w:rPr>
-          <w:rStyle w:val="Fuerte"/>
-          <w:rFonts w:ascii="Segoe UI" w:eastAsia="Times New Roman" w:hAnsi="Segoe UI" w:cs="Segoe UI"/>
-          <w:sz w:val="21"/>
-          <w:szCs w:val="21"/>
-          <w:lang w:val="es-ES"/>
-        </w:rPr>
+        <w:divId w:val="782577528"/>
+        <w:rPr>
+          <w:rFonts w:ascii="Segoe UI" w:eastAsia="Times New Roman" w:hAnsi="Segoe UI" w:cs="Segoe UI"/>
+          <w:sz w:val="21"/>
+          <w:szCs w:val="21"/>
+          <w:lang w:val="es-ES"/>
+        </w:rPr>
+      </w:pPr>
+      <w:r>
+        <w:rPr>
+          <w:rStyle w:val="Fuerte"/>
+          <w:rFonts w:ascii="Segoe UI" w:eastAsia="Times New Roman" w:hAnsi="Segoe UI" w:cs="Segoe UI"/>
+          <w:sz w:val="21"/>
+          <w:szCs w:val="21"/>
+          <w:lang w:val="es-ES"/>
+        </w:rPr>
+        <w:lastRenderedPageBreak/>
         <w:t>¿Qué pasa si marco más de lo permitido?</w:t>
       </w:r>
       <w:r>
@@ -1696,7 +1762,7 @@
         </w:numPr>
         <w:shd w:val="clear" w:color="auto" w:fill="FFFFFF"/>
         <w:spacing w:before="100" w:beforeAutospacing="1" w:after="75"/>
-        <w:divId w:val="904099955"/>
+        <w:divId w:val="782577528"/>
         <w:rPr>
           <w:rFonts w:ascii="Segoe UI" w:eastAsia="Times New Roman" w:hAnsi="Segoe UI" w:cs="Segoe UI"/>
           <w:sz w:val="21"/>
@@ -1746,7 +1812,7 @@
     <w:p>
       <w:pPr>
         <w:shd w:val="clear" w:color="auto" w:fill="FFFFFF"/>
-        <w:divId w:val="904099955"/>
+        <w:divId w:val="782577528"/>
         <w:rPr>
           <w:rFonts w:ascii="Segoe UI" w:eastAsia="Times New Roman" w:hAnsi="Segoe UI" w:cs="Segoe UI"/>
           <w:lang w:val="es-ES"/>
@@ -1787,9 +1853,9 @@
 <file path=word/numbering.xml><?xml version="1.0" encoding="utf-8"?>
 <w:numbering xmlns:wpc="http://schemas.microsoft.com/office/word/2010/wordprocessingCanvas" xmlns:cx="http://schemas.microsoft.com/office/drawing/2014/chartex" xmlns:cx1="http://schemas.microsoft.com/office/drawing/2015/9/8/chartex" xmlns:cx2="http://schemas.microsoft.com/office/drawing/2015/10/21/chartex" xmlns:cx3="http://schemas.microsoft.com/office/drawing/2016/5/9/chartex" xmlns:cx4="http://schemas.microsoft.com/office/drawing/2016/5/10/chartex" xmlns:cx5="http://schemas.microsoft.com/office/drawing/2016/5/11/chartex" xmlns:cx6="http://schemas.microsoft.com/office/drawing/2016/5/12/chartex" xmlns:cx7="http://schemas.microsoft.com/office/drawing/2016/5/13/chartex" xmlns:cx8="http://schemas.microsoft.com/office/drawing/2016/5/14/chartex" xmlns:mc="http://schemas.openxmlformats.org/markup-compatibility/2006" xmlns:aink="http://schemas.microsoft.com/office/drawing/2016/ink" xmlns:am3d="http://schemas.microsoft.com/office/drawing/2017/model3d" xmlns:o="urn:schemas-microsoft-com:office:office" xmlns:oel="http://schemas.microsoft.com/office/2019/extlst" xmlns:r="http://schemas.openxmlformats.org/officeDocument/2006/relationships" xmlns:m="http://schemas.openxmlformats.org/officeDocument/2006/math" xmlns:v="urn:schemas-microsoft-com:vml" xmlns:wp14="http://schemas.microsoft.com/office/word/2010/wordprocessingDrawing" xmlns:wp="http://schemas.openxmlformats.org/drawingml/2006/wordprocessingDrawing" xmlns:w10="urn:schemas-microsoft-com:office:word" xmlns:w="http://schemas.openxmlformats.org/wordprocessingml/2006/main" xmlns:w14="http://schemas.microsoft.com/office/word/2010/wordml" xmlns:w15="http://schemas.microsoft.com/office/word/2012/wordml" xmlns:w16cex="http://schemas.microsoft.com/office/word/2018/wordml/cex" xmlns:w16cid="http://schemas.microsoft.com/office/word/2016/wordml/cid" xmlns:w16="http://schemas.microsoft.com/office/word/2018/wordml" xmlns:w16du="http://schemas.microsoft.com/office/word/2023/wordml/word16du" xmlns:w16sdtdh="http://schemas.microsoft.com/office/word/2020/wordml/sdtdatahash" xmlns:w16sdtfl="http://schemas.microsoft.com/office/word/2024/wordml/sdtformatlock" xmlns:w16se="http://schemas.microsoft.com/office/word/2015/wordml/symex" xmlns:wpg="http://schemas.microsoft.com/office/word/2010/wordprocessingGroup" xmlns:wpi="http://schemas.microsoft.com/office/word/2010/wordprocessingInk" xmlns:wne="http://schemas.microsoft.com/office/word/2006/wordml" xmlns:wps="http://schemas.microsoft.com/office/word/2010/wordprocessingShape" mc:Ignorable="w14 w15 w16se w16cid w16 w16cex w16sdtdh w16sdtfl w16du wp14">
   <w:abstractNum w:abstractNumId="0" w15:restartNumberingAfterBreak="0">
-    <w:nsid w:val="092E5184"/>
+    <w:nsid w:val="113F5F02"/>
     <w:multiLevelType w:val="multilevel"/>
-    <w:tmpl w:val="E6CA9AEC"/>
+    <w:tmpl w:val="2F7044D8"/>
     <w:lvl w:ilvl="0">
       <w:start w:val="1"/>
       <w:numFmt w:val="bullet"/>
@@ -1936,9 +2002,9 @@
     </w:lvl>
   </w:abstractNum>
   <w:abstractNum w:abstractNumId="1" w15:restartNumberingAfterBreak="0">
-    <w:nsid w:val="1DE469A8"/>
+    <w:nsid w:val="126A272F"/>
     <w:multiLevelType w:val="multilevel"/>
-    <w:tmpl w:val="3ECC6CFC"/>
+    <w:tmpl w:val="C1D8076A"/>
     <w:lvl w:ilvl="0">
       <w:start w:val="1"/>
       <w:numFmt w:val="bullet"/>
@@ -2085,9 +2151,9 @@
     </w:lvl>
   </w:abstractNum>
   <w:abstractNum w:abstractNumId="2" w15:restartNumberingAfterBreak="0">
-    <w:nsid w:val="406A6A36"/>
+    <w:nsid w:val="1FC32CB0"/>
     <w:multiLevelType w:val="multilevel"/>
-    <w:tmpl w:val="DB2A62CE"/>
+    <w:tmpl w:val="1CAE7F8A"/>
     <w:lvl w:ilvl="0">
       <w:start w:val="1"/>
       <w:numFmt w:val="bullet"/>
@@ -2234,9 +2300,307 @@
     </w:lvl>
   </w:abstractNum>
   <w:abstractNum w:abstractNumId="3" w15:restartNumberingAfterBreak="0">
-    <w:nsid w:val="42CC60A3"/>
+    <w:nsid w:val="3EBA1EA2"/>
     <w:multiLevelType w:val="multilevel"/>
-    <w:tmpl w:val="0F186758"/>
+    <w:tmpl w:val="C3BEE5D0"/>
+    <w:lvl w:ilvl="0">
+      <w:start w:val="1"/>
+      <w:numFmt w:val="bullet"/>
+      <w:lvlText w:val=""/>
+      <w:lvlJc w:val="left"/>
+      <w:pPr>
+        <w:tabs>
+          <w:tab w:val="num" w:pos="720"/>
+        </w:tabs>
+        <w:ind w:left="720" w:hanging="360"/>
+      </w:pPr>
+      <w:rPr>
+        <w:rFonts w:ascii="Symbol" w:hAnsi="Symbol" w:hint="default"/>
+        <w:sz w:val="20"/>
+      </w:rPr>
+    </w:lvl>
+    <w:lvl w:ilvl="1" w:tentative="1">
+      <w:start w:val="1"/>
+      <w:numFmt w:val="bullet"/>
+      <w:lvlText w:val="o"/>
+      <w:lvlJc w:val="left"/>
+      <w:pPr>
+        <w:tabs>
+          <w:tab w:val="num" w:pos="1440"/>
+        </w:tabs>
+        <w:ind w:left="1440" w:hanging="360"/>
+      </w:pPr>
+      <w:rPr>
+        <w:rFonts w:ascii="Courier New" w:hAnsi="Courier New" w:hint="default"/>
+        <w:sz w:val="20"/>
+      </w:rPr>
+    </w:lvl>
+    <w:lvl w:ilvl="2" w:tentative="1">
+      <w:start w:val="1"/>
+      <w:numFmt w:val="bullet"/>
+      <w:lvlText w:val=""/>
+      <w:lvlJc w:val="left"/>
+      <w:pPr>
+        <w:tabs>
+          <w:tab w:val="num" w:pos="2160"/>
+        </w:tabs>
+        <w:ind w:left="2160" w:hanging="360"/>
+      </w:pPr>
+      <w:rPr>
+        <w:rFonts w:ascii="Wingdings" w:hAnsi="Wingdings" w:hint="default"/>
+        <w:sz w:val="20"/>
+      </w:rPr>
+    </w:lvl>
+    <w:lvl w:ilvl="3" w:tentative="1">
+      <w:start w:val="1"/>
+      <w:numFmt w:val="bullet"/>
+      <w:lvlText w:val=""/>
+      <w:lvlJc w:val="left"/>
+      <w:pPr>
+        <w:tabs>
+          <w:tab w:val="num" w:pos="2880"/>
+        </w:tabs>
+        <w:ind w:left="2880" w:hanging="360"/>
+      </w:pPr>
+      <w:rPr>
+        <w:rFonts w:ascii="Wingdings" w:hAnsi="Wingdings" w:hint="default"/>
+        <w:sz w:val="20"/>
+      </w:rPr>
+    </w:lvl>
+    <w:lvl w:ilvl="4" w:tentative="1">
+      <w:start w:val="1"/>
+      <w:numFmt w:val="bullet"/>
+      <w:lvlText w:val=""/>
+      <w:lvlJc w:val="left"/>
+      <w:pPr>
+        <w:tabs>
+          <w:tab w:val="num" w:pos="3600"/>
+        </w:tabs>
+        <w:ind w:left="3600" w:hanging="360"/>
+      </w:pPr>
+      <w:rPr>
+        <w:rFonts w:ascii="Wingdings" w:hAnsi="Wingdings" w:hint="default"/>
+        <w:sz w:val="20"/>
+      </w:rPr>
+    </w:lvl>
+    <w:lvl w:ilvl="5" w:tentative="1">
+      <w:start w:val="1"/>
+      <w:numFmt w:val="bullet"/>
+      <w:lvlText w:val=""/>
+      <w:lvlJc w:val="left"/>
+      <w:pPr>
+        <w:tabs>
+          <w:tab w:val="num" w:pos="4320"/>
+        </w:tabs>
+        <w:ind w:left="4320" w:hanging="360"/>
+      </w:pPr>
+      <w:rPr>
+        <w:rFonts w:ascii="Wingdings" w:hAnsi="Wingdings" w:hint="default"/>
+        <w:sz w:val="20"/>
+      </w:rPr>
+    </w:lvl>
+    <w:lvl w:ilvl="6" w:tentative="1">
+      <w:start w:val="1"/>
+      <w:numFmt w:val="bullet"/>
+      <w:lvlText w:val=""/>
+      <w:lvlJc w:val="left"/>
+      <w:pPr>
+        <w:tabs>
+          <w:tab w:val="num" w:pos="5040"/>
+        </w:tabs>
+        <w:ind w:left="5040" w:hanging="360"/>
+      </w:pPr>
+      <w:rPr>
+        <w:rFonts w:ascii="Wingdings" w:hAnsi="Wingdings" w:hint="default"/>
+        <w:sz w:val="20"/>
+      </w:rPr>
+    </w:lvl>
+    <w:lvl w:ilvl="7" w:tentative="1">
+      <w:start w:val="1"/>
+      <w:numFmt w:val="bullet"/>
+      <w:lvlText w:val=""/>
+      <w:lvlJc w:val="left"/>
+      <w:pPr>
+        <w:tabs>
+          <w:tab w:val="num" w:pos="5760"/>
+        </w:tabs>
+        <w:ind w:left="5760" w:hanging="360"/>
+      </w:pPr>
+      <w:rPr>
+        <w:rFonts w:ascii="Wingdings" w:hAnsi="Wingdings" w:hint="default"/>
+        <w:sz w:val="20"/>
+      </w:rPr>
+    </w:lvl>
+    <w:lvl w:ilvl="8" w:tentative="1">
+      <w:start w:val="1"/>
+      <w:numFmt w:val="bullet"/>
+      <w:lvlText w:val=""/>
+      <w:lvlJc w:val="left"/>
+      <w:pPr>
+        <w:tabs>
+          <w:tab w:val="num" w:pos="6480"/>
+        </w:tabs>
+        <w:ind w:left="6480" w:hanging="360"/>
+      </w:pPr>
+      <w:rPr>
+        <w:rFonts w:ascii="Wingdings" w:hAnsi="Wingdings" w:hint="default"/>
+        <w:sz w:val="20"/>
+      </w:rPr>
+    </w:lvl>
+  </w:abstractNum>
+  <w:abstractNum w:abstractNumId="4" w15:restartNumberingAfterBreak="0">
+    <w:nsid w:val="43235F58"/>
+    <w:multiLevelType w:val="multilevel"/>
+    <w:tmpl w:val="0706C8E0"/>
+    <w:lvl w:ilvl="0">
+      <w:start w:val="1"/>
+      <w:numFmt w:val="bullet"/>
+      <w:lvlText w:val=""/>
+      <w:lvlJc w:val="left"/>
+      <w:pPr>
+        <w:tabs>
+          <w:tab w:val="num" w:pos="720"/>
+        </w:tabs>
+        <w:ind w:left="720" w:hanging="360"/>
+      </w:pPr>
+      <w:rPr>
+        <w:rFonts w:ascii="Symbol" w:hAnsi="Symbol" w:hint="default"/>
+        <w:sz w:val="20"/>
+      </w:rPr>
+    </w:lvl>
+    <w:lvl w:ilvl="1" w:tentative="1">
+      <w:start w:val="1"/>
+      <w:numFmt w:val="bullet"/>
+      <w:lvlText w:val="o"/>
+      <w:lvlJc w:val="left"/>
+      <w:pPr>
+        <w:tabs>
+          <w:tab w:val="num" w:pos="1440"/>
+        </w:tabs>
+        <w:ind w:left="1440" w:hanging="360"/>
+      </w:pPr>
+      <w:rPr>
+        <w:rFonts w:ascii="Courier New" w:hAnsi="Courier New" w:hint="default"/>
+        <w:sz w:val="20"/>
+      </w:rPr>
+    </w:lvl>
+    <w:lvl w:ilvl="2" w:tentative="1">
+      <w:start w:val="1"/>
+      <w:numFmt w:val="bullet"/>
+      <w:lvlText w:val=""/>
+      <w:lvlJc w:val="left"/>
+      <w:pPr>
+        <w:tabs>
+          <w:tab w:val="num" w:pos="2160"/>
+        </w:tabs>
+        <w:ind w:left="2160" w:hanging="360"/>
+      </w:pPr>
+      <w:rPr>
+        <w:rFonts w:ascii="Wingdings" w:hAnsi="Wingdings" w:hint="default"/>
+        <w:sz w:val="20"/>
+      </w:rPr>
+    </w:lvl>
+    <w:lvl w:ilvl="3" w:tentative="1">
+      <w:start w:val="1"/>
+      <w:numFmt w:val="bullet"/>
+      <w:lvlText w:val=""/>
+      <w:lvlJc w:val="left"/>
+      <w:pPr>
+        <w:tabs>
+          <w:tab w:val="num" w:pos="2880"/>
+        </w:tabs>
+        <w:ind w:left="2880" w:hanging="360"/>
+      </w:pPr>
+      <w:rPr>
+        <w:rFonts w:ascii="Wingdings" w:hAnsi="Wingdings" w:hint="default"/>
+        <w:sz w:val="20"/>
+      </w:rPr>
+    </w:lvl>
+    <w:lvl w:ilvl="4" w:tentative="1">
+      <w:start w:val="1"/>
+      <w:numFmt w:val="bullet"/>
+      <w:lvlText w:val=""/>
+      <w:lvlJc w:val="left"/>
+      <w:pPr>
+        <w:tabs>
+          <w:tab w:val="num" w:pos="3600"/>
+        </w:tabs>
+        <w:ind w:left="3600" w:hanging="360"/>
+      </w:pPr>
+      <w:rPr>
+        <w:rFonts w:ascii="Wingdings" w:hAnsi="Wingdings" w:hint="default"/>
+        <w:sz w:val="20"/>
+      </w:rPr>
+    </w:lvl>
+    <w:lvl w:ilvl="5" w:tentative="1">
+      <w:start w:val="1"/>
+      <w:numFmt w:val="bullet"/>
+      <w:lvlText w:val=""/>
+      <w:lvlJc w:val="left"/>
+      <w:pPr>
+        <w:tabs>
+          <w:tab w:val="num" w:pos="4320"/>
+        </w:tabs>
+        <w:ind w:left="4320" w:hanging="360"/>
+      </w:pPr>
+      <w:rPr>
+        <w:rFonts w:ascii="Wingdings" w:hAnsi="Wingdings" w:hint="default"/>
+        <w:sz w:val="20"/>
+      </w:rPr>
+    </w:lvl>
+    <w:lvl w:ilvl="6" w:tentative="1">
+      <w:start w:val="1"/>
+      <w:numFmt w:val="bullet"/>
+      <w:lvlText w:val=""/>
+      <w:lvlJc w:val="left"/>
+      <w:pPr>
+        <w:tabs>
+          <w:tab w:val="num" w:pos="5040"/>
+        </w:tabs>
+        <w:ind w:left="5040" w:hanging="360"/>
+      </w:pPr>
+      <w:rPr>
+        <w:rFonts w:ascii="Wingdings" w:hAnsi="Wingdings" w:hint="default"/>
+        <w:sz w:val="20"/>
+      </w:rPr>
+    </w:lvl>
+    <w:lvl w:ilvl="7" w:tentative="1">
+      <w:start w:val="1"/>
+      <w:numFmt w:val="bullet"/>
+      <w:lvlText w:val=""/>
+      <w:lvlJc w:val="left"/>
+      <w:pPr>
+        <w:tabs>
+          <w:tab w:val="num" w:pos="5760"/>
+        </w:tabs>
+        <w:ind w:left="5760" w:hanging="360"/>
+      </w:pPr>
+      <w:rPr>
+        <w:rFonts w:ascii="Wingdings" w:hAnsi="Wingdings" w:hint="default"/>
+        <w:sz w:val="20"/>
+      </w:rPr>
+    </w:lvl>
+    <w:lvl w:ilvl="8" w:tentative="1">
+      <w:start w:val="1"/>
+      <w:numFmt w:val="bullet"/>
+      <w:lvlText w:val=""/>
+      <w:lvlJc w:val="left"/>
+      <w:pPr>
+        <w:tabs>
+          <w:tab w:val="num" w:pos="6480"/>
+        </w:tabs>
+        <w:ind w:left="6480" w:hanging="360"/>
+      </w:pPr>
+      <w:rPr>
+        <w:rFonts w:ascii="Wingdings" w:hAnsi="Wingdings" w:hint="default"/>
+        <w:sz w:val="20"/>
+      </w:rPr>
+    </w:lvl>
+  </w:abstractNum>
+  <w:abstractNum w:abstractNumId="5" w15:restartNumberingAfterBreak="0">
+    <w:nsid w:val="559D2417"/>
+    <w:multiLevelType w:val="multilevel"/>
+    <w:tmpl w:val="D50E39B8"/>
     <w:lvl w:ilvl="0">
       <w:start w:val="1"/>
       <w:numFmt w:val="decimal"/>
@@ -2346,10 +2710,10 @@
       </w:pPr>
     </w:lvl>
   </w:abstractNum>
-  <w:abstractNum w:abstractNumId="4" w15:restartNumberingAfterBreak="0">
-    <w:nsid w:val="44A12840"/>
+  <w:abstractNum w:abstractNumId="6" w15:restartNumberingAfterBreak="0">
+    <w:nsid w:val="783B4EBF"/>
     <w:multiLevelType w:val="multilevel"/>
-    <w:tmpl w:val="BA2E238A"/>
+    <w:tmpl w:val="7186A6DA"/>
     <w:lvl w:ilvl="0">
       <w:start w:val="1"/>
       <w:numFmt w:val="bullet"/>
@@ -2495,324 +2859,26 @@
       </w:rPr>
     </w:lvl>
   </w:abstractNum>
-  <w:abstractNum w:abstractNumId="5" w15:restartNumberingAfterBreak="0">
-    <w:nsid w:val="49440C9B"/>
-    <w:multiLevelType w:val="multilevel"/>
-    <w:tmpl w:val="916C7AD0"/>
-    <w:lvl w:ilvl="0">
-      <w:start w:val="1"/>
-      <w:numFmt w:val="bullet"/>
-      <w:lvlText w:val=""/>
-      <w:lvlJc w:val="left"/>
-      <w:pPr>
-        <w:tabs>
-          <w:tab w:val="num" w:pos="720"/>
-        </w:tabs>
-        <w:ind w:left="720" w:hanging="360"/>
-      </w:pPr>
-      <w:rPr>
-        <w:rFonts w:ascii="Symbol" w:hAnsi="Symbol" w:hint="default"/>
-        <w:sz w:val="20"/>
-      </w:rPr>
-    </w:lvl>
-    <w:lvl w:ilvl="1" w:tentative="1">
-      <w:start w:val="1"/>
-      <w:numFmt w:val="bullet"/>
-      <w:lvlText w:val="o"/>
-      <w:lvlJc w:val="left"/>
-      <w:pPr>
-        <w:tabs>
-          <w:tab w:val="num" w:pos="1440"/>
-        </w:tabs>
-        <w:ind w:left="1440" w:hanging="360"/>
-      </w:pPr>
-      <w:rPr>
-        <w:rFonts w:ascii="Courier New" w:hAnsi="Courier New" w:hint="default"/>
-        <w:sz w:val="20"/>
-      </w:rPr>
-    </w:lvl>
-    <w:lvl w:ilvl="2" w:tentative="1">
-      <w:start w:val="1"/>
-      <w:numFmt w:val="bullet"/>
-      <w:lvlText w:val=""/>
-      <w:lvlJc w:val="left"/>
-      <w:pPr>
-        <w:tabs>
-          <w:tab w:val="num" w:pos="2160"/>
-        </w:tabs>
-        <w:ind w:left="2160" w:hanging="360"/>
-      </w:pPr>
-      <w:rPr>
-        <w:rFonts w:ascii="Wingdings" w:hAnsi="Wingdings" w:hint="default"/>
-        <w:sz w:val="20"/>
-      </w:rPr>
-    </w:lvl>
-    <w:lvl w:ilvl="3" w:tentative="1">
-      <w:start w:val="1"/>
-      <w:numFmt w:val="bullet"/>
-      <w:lvlText w:val=""/>
-      <w:lvlJc w:val="left"/>
-      <w:pPr>
-        <w:tabs>
-          <w:tab w:val="num" w:pos="2880"/>
-        </w:tabs>
-        <w:ind w:left="2880" w:hanging="360"/>
-      </w:pPr>
-      <w:rPr>
-        <w:rFonts w:ascii="Wingdings" w:hAnsi="Wingdings" w:hint="default"/>
-        <w:sz w:val="20"/>
-      </w:rPr>
-    </w:lvl>
-    <w:lvl w:ilvl="4" w:tentative="1">
-      <w:start w:val="1"/>
-      <w:numFmt w:val="bullet"/>
-      <w:lvlText w:val=""/>
-      <w:lvlJc w:val="left"/>
-      <w:pPr>
-        <w:tabs>
-          <w:tab w:val="num" w:pos="3600"/>
-        </w:tabs>
-        <w:ind w:left="3600" w:hanging="360"/>
-      </w:pPr>
-      <w:rPr>
-        <w:rFonts w:ascii="Wingdings" w:hAnsi="Wingdings" w:hint="default"/>
-        <w:sz w:val="20"/>
-      </w:rPr>
-    </w:lvl>
-    <w:lvl w:ilvl="5" w:tentative="1">
-      <w:start w:val="1"/>
-      <w:numFmt w:val="bullet"/>
-      <w:lvlText w:val=""/>
-      <w:lvlJc w:val="left"/>
-      <w:pPr>
-        <w:tabs>
-          <w:tab w:val="num" w:pos="4320"/>
-        </w:tabs>
-        <w:ind w:left="4320" w:hanging="360"/>
-      </w:pPr>
-      <w:rPr>
-        <w:rFonts w:ascii="Wingdings" w:hAnsi="Wingdings" w:hint="default"/>
-        <w:sz w:val="20"/>
-      </w:rPr>
-    </w:lvl>
-    <w:lvl w:ilvl="6" w:tentative="1">
-      <w:start w:val="1"/>
-      <w:numFmt w:val="bullet"/>
-      <w:lvlText w:val=""/>
-      <w:lvlJc w:val="left"/>
-      <w:pPr>
-        <w:tabs>
-          <w:tab w:val="num" w:pos="5040"/>
-        </w:tabs>
-        <w:ind w:left="5040" w:hanging="360"/>
-      </w:pPr>
-      <w:rPr>
-        <w:rFonts w:ascii="Wingdings" w:hAnsi="Wingdings" w:hint="default"/>
-        <w:sz w:val="20"/>
-      </w:rPr>
-    </w:lvl>
-    <w:lvl w:ilvl="7" w:tentative="1">
-      <w:start w:val="1"/>
-      <w:numFmt w:val="bullet"/>
-      <w:lvlText w:val=""/>
-      <w:lvlJc w:val="left"/>
-      <w:pPr>
-        <w:tabs>
-          <w:tab w:val="num" w:pos="5760"/>
-        </w:tabs>
-        <w:ind w:left="5760" w:hanging="360"/>
-      </w:pPr>
-      <w:rPr>
-        <w:rFonts w:ascii="Wingdings" w:hAnsi="Wingdings" w:hint="default"/>
-        <w:sz w:val="20"/>
-      </w:rPr>
-    </w:lvl>
-    <w:lvl w:ilvl="8" w:tentative="1">
-      <w:start w:val="1"/>
-      <w:numFmt w:val="bullet"/>
-      <w:lvlText w:val=""/>
-      <w:lvlJc w:val="left"/>
-      <w:pPr>
-        <w:tabs>
-          <w:tab w:val="num" w:pos="6480"/>
-        </w:tabs>
-        <w:ind w:left="6480" w:hanging="360"/>
-      </w:pPr>
-      <w:rPr>
-        <w:rFonts w:ascii="Wingdings" w:hAnsi="Wingdings" w:hint="default"/>
-        <w:sz w:val="20"/>
-      </w:rPr>
-    </w:lvl>
-  </w:abstractNum>
-  <w:abstractNum w:abstractNumId="6" w15:restartNumberingAfterBreak="0">
-    <w:nsid w:val="6FCA712D"/>
-    <w:multiLevelType w:val="multilevel"/>
-    <w:tmpl w:val="50A0885C"/>
-    <w:lvl w:ilvl="0">
-      <w:start w:val="1"/>
-      <w:numFmt w:val="bullet"/>
-      <w:lvlText w:val=""/>
-      <w:lvlJc w:val="left"/>
-      <w:pPr>
-        <w:tabs>
-          <w:tab w:val="num" w:pos="720"/>
-        </w:tabs>
-        <w:ind w:left="720" w:hanging="360"/>
-      </w:pPr>
-      <w:rPr>
-        <w:rFonts w:ascii="Symbol" w:hAnsi="Symbol" w:hint="default"/>
-        <w:sz w:val="20"/>
-      </w:rPr>
-    </w:lvl>
-    <w:lvl w:ilvl="1" w:tentative="1">
-      <w:start w:val="1"/>
-      <w:numFmt w:val="bullet"/>
-      <w:lvlText w:val="o"/>
-      <w:lvlJc w:val="left"/>
-      <w:pPr>
-        <w:tabs>
-          <w:tab w:val="num" w:pos="1440"/>
-        </w:tabs>
-        <w:ind w:left="1440" w:hanging="360"/>
-      </w:pPr>
-      <w:rPr>
-        <w:rFonts w:ascii="Courier New" w:hAnsi="Courier New" w:hint="default"/>
-        <w:sz w:val="20"/>
-      </w:rPr>
-    </w:lvl>
-    <w:lvl w:ilvl="2" w:tentative="1">
-      <w:start w:val="1"/>
-      <w:numFmt w:val="bullet"/>
-      <w:lvlText w:val=""/>
-      <w:lvlJc w:val="left"/>
-      <w:pPr>
-        <w:tabs>
-          <w:tab w:val="num" w:pos="2160"/>
-        </w:tabs>
-        <w:ind w:left="2160" w:hanging="360"/>
-      </w:pPr>
-      <w:rPr>
-        <w:rFonts w:ascii="Wingdings" w:hAnsi="Wingdings" w:hint="default"/>
-        <w:sz w:val="20"/>
-      </w:rPr>
-    </w:lvl>
-    <w:lvl w:ilvl="3" w:tentative="1">
-      <w:start w:val="1"/>
-      <w:numFmt w:val="bullet"/>
-      <w:lvlText w:val=""/>
-      <w:lvlJc w:val="left"/>
-      <w:pPr>
-        <w:tabs>
-          <w:tab w:val="num" w:pos="2880"/>
-        </w:tabs>
-        <w:ind w:left="2880" w:hanging="360"/>
-      </w:pPr>
-      <w:rPr>
-        <w:rFonts w:ascii="Wingdings" w:hAnsi="Wingdings" w:hint="default"/>
-        <w:sz w:val="20"/>
-      </w:rPr>
-    </w:lvl>
-    <w:lvl w:ilvl="4" w:tentative="1">
-      <w:start w:val="1"/>
-      <w:numFmt w:val="bullet"/>
-      <w:lvlText w:val=""/>
-      <w:lvlJc w:val="left"/>
-      <w:pPr>
-        <w:tabs>
-          <w:tab w:val="num" w:pos="3600"/>
-        </w:tabs>
-        <w:ind w:left="3600" w:hanging="360"/>
-      </w:pPr>
-      <w:rPr>
-        <w:rFonts w:ascii="Wingdings" w:hAnsi="Wingdings" w:hint="default"/>
-        <w:sz w:val="20"/>
-      </w:rPr>
-    </w:lvl>
-    <w:lvl w:ilvl="5" w:tentative="1">
-      <w:start w:val="1"/>
-      <w:numFmt w:val="bullet"/>
-      <w:lvlText w:val=""/>
-      <w:lvlJc w:val="left"/>
-      <w:pPr>
-        <w:tabs>
-          <w:tab w:val="num" w:pos="4320"/>
-        </w:tabs>
-        <w:ind w:left="4320" w:hanging="360"/>
-      </w:pPr>
-      <w:rPr>
-        <w:rFonts w:ascii="Wingdings" w:hAnsi="Wingdings" w:hint="default"/>
-        <w:sz w:val="20"/>
-      </w:rPr>
-    </w:lvl>
-    <w:lvl w:ilvl="6" w:tentative="1">
-      <w:start w:val="1"/>
-      <w:numFmt w:val="bullet"/>
-      <w:lvlText w:val=""/>
-      <w:lvlJc w:val="left"/>
-      <w:pPr>
-        <w:tabs>
-          <w:tab w:val="num" w:pos="5040"/>
-        </w:tabs>
-        <w:ind w:left="5040" w:hanging="360"/>
-      </w:pPr>
-      <w:rPr>
-        <w:rFonts w:ascii="Wingdings" w:hAnsi="Wingdings" w:hint="default"/>
-        <w:sz w:val="20"/>
-      </w:rPr>
-    </w:lvl>
-    <w:lvl w:ilvl="7" w:tentative="1">
-      <w:start w:val="1"/>
-      <w:numFmt w:val="bullet"/>
-      <w:lvlText w:val=""/>
-      <w:lvlJc w:val="left"/>
-      <w:pPr>
-        <w:tabs>
-          <w:tab w:val="num" w:pos="5760"/>
-        </w:tabs>
-        <w:ind w:left="5760" w:hanging="360"/>
-      </w:pPr>
-      <w:rPr>
-        <w:rFonts w:ascii="Wingdings" w:hAnsi="Wingdings" w:hint="default"/>
-        <w:sz w:val="20"/>
-      </w:rPr>
-    </w:lvl>
-    <w:lvl w:ilvl="8" w:tentative="1">
-      <w:start w:val="1"/>
-      <w:numFmt w:val="bullet"/>
-      <w:lvlText w:val=""/>
-      <w:lvlJc w:val="left"/>
-      <w:pPr>
-        <w:tabs>
-          <w:tab w:val="num" w:pos="6480"/>
-        </w:tabs>
-        <w:ind w:left="6480" w:hanging="360"/>
-      </w:pPr>
-      <w:rPr>
-        <w:rFonts w:ascii="Wingdings" w:hAnsi="Wingdings" w:hint="default"/>
-        <w:sz w:val="20"/>
-      </w:rPr>
-    </w:lvl>
-  </w:abstractNum>
-  <w:num w:numId="1" w16cid:durableId="144200323">
-    <w:abstractNumId w:val="3"/>
+  <w:num w:numId="1" w16cid:durableId="1204749543">
+    <w:abstractNumId w:val="5"/>
   </w:num>
-  <w:num w:numId="2" w16cid:durableId="1572231992">
+  <w:num w:numId="2" w16cid:durableId="2030525366">
+    <w:abstractNumId w:val="4"/>
+  </w:num>
+  <w:num w:numId="3" w16cid:durableId="1019500979">
     <w:abstractNumId w:val="0"/>
   </w:num>
-  <w:num w:numId="3" w16cid:durableId="2115124416">
+  <w:num w:numId="4" w16cid:durableId="789665093">
     <w:abstractNumId w:val="2"/>
   </w:num>
-  <w:num w:numId="4" w16cid:durableId="1541169907">
+  <w:num w:numId="5" w16cid:durableId="1859350718">
+    <w:abstractNumId w:val="1"/>
+  </w:num>
+  <w:num w:numId="6" w16cid:durableId="965896010">
     <w:abstractNumId w:val="6"/>
   </w:num>
-  <w:num w:numId="5" w16cid:durableId="1529177980">
-    <w:abstractNumId w:val="4"/>
-  </w:num>
-  <w:num w:numId="6" w16cid:durableId="252592960">
-    <w:abstractNumId w:val="5"/>
-  </w:num>
-  <w:num w:numId="7" w16cid:durableId="932592544">
-    <w:abstractNumId w:val="1"/>
+  <w:num w:numId="7" w16cid:durableId="236943595">
+    <w:abstractNumId w:val="3"/>
   </w:num>
 </w:numbering>
 </file>
@@ -3350,6 +3416,17 @@
       <w:szCs w:val="21"/>
     </w:rPr>
   </w:style>
+  <w:style w:type="paragraph" w:customStyle="1" w:styleId="logo">
+    <w:name w:val="logo"/>
+    <w:basedOn w:val="Normal"/>
+    <w:pPr>
+      <w:spacing w:before="100" w:beforeAutospacing="1" w:after="75"/>
+    </w:pPr>
+    <w:rPr>
+      <w:sz w:val="21"/>
+      <w:szCs w:val="21"/>
+    </w:rPr>
+  </w:style>
   <w:style w:type="paragraph" w:customStyle="1" w:styleId="nota">
     <w:name w:val="nota"/>
     <w:basedOn w:val="Normal"/>

</xml_diff>